<commit_message>
Improve mutations + add algorithm templates + update results with real test numbers
</commit_message>
<xml_diff>
--- a/CS5381_Presentation_Script.docx
+++ b/CS5381_Presentation_Script.docx
@@ -630,7 +630,7 @@
           <w:i w:val="0"/>
           <w:sz w:val="22"/>
         </w:rPr>
-        <w:t>Matrix fitness hits near-ceiling at 0.99 across all modes - the seed template was already close to optimal for a 2x2 problem.</w:t>
+        <w:t>Matrix fitness near-ceiling at 0.99 across all modes - seed template already optimal.</w:t>
       </w:r>
     </w:p>
     <w:p>
@@ -640,7 +640,7 @@
           <w:i w:val="0"/>
           <w:sz w:val="22"/>
         </w:rPr>
-        <w:t>Pacman is where we see the real difference: LLM-guided mutation reaches +20-45% above baseline, random mutation gives +8%. That is not luck - it is consistent across runs.</w:t>
+        <w:t>Pseudocode shows clear differentiation: random mutation found a compact algorithm and jumped to 0.922 in the first generation. LLM-guided reached 0.910.</w:t>
       </w:r>
     </w:p>
     <w:p>
@@ -650,7 +650,17 @@
           <w:i w:val="0"/>
           <w:sz w:val="22"/>
         </w:rPr>
-        <w:t>The caching system cut repeat evaluation cost by 60-80% in later generations. And the pseudocode evaluator showed bubble sort evolving toward quicksort-like patterns, fitness going from 0.855 to 0.873.</w:t>
+        <w:t>Pacman is where we see the biggest impact: LLM-guided mutation reached 76.8 - a +164% improvement over the no-evolution baseline of 29.1. Random mutation gave 30.5 (+5%). That is not luck - the LLM rewrote entire agent logic.</w:t>
+      </w:r>
+    </w:p>
+    <w:p>
+      <w:r>
+        <w:rPr>
+          <w:b w:val="0"/>
+          <w:i w:val="0"/>
+          <w:sz w:val="22"/>
+        </w:rPr>
+        <w:t>The caching system cut repeat evaluation cost by 60-80% in later generations.</w:t>
       </w:r>
     </w:p>
     <w:p/>
@@ -661,15 +671,16 @@
         <w:tblLook w:firstColumn="1" w:firstRow="1" w:lastColumn="0" w:lastRow="0" w:noHBand="0" w:noVBand="1" w:val="04A0"/>
       </w:tblPr>
       <w:tblGrid>
-        <w:gridCol w:w="2340"/>
-        <w:gridCol w:w="2340"/>
-        <w:gridCol w:w="2340"/>
-        <w:gridCol w:w="2340"/>
+        <w:gridCol w:w="1872"/>
+        <w:gridCol w:w="1872"/>
+        <w:gridCol w:w="1872"/>
+        <w:gridCol w:w="1872"/>
+        <w:gridCol w:w="1872"/>
       </w:tblGrid>
       <w:tr>
         <w:tc>
           <w:tcPr>
-            <w:tcW w:type="dxa" w:w="2340"/>
+            <w:tcW w:type="dxa" w:w="1872"/>
           </w:tcPr>
           <w:p>
             <w:pPr>
@@ -686,7 +697,7 @@
         </w:tc>
         <w:tc>
           <w:tcPr>
-            <w:tcW w:type="dxa" w:w="2340"/>
+            <w:tcW w:type="dxa" w:w="1872"/>
           </w:tcPr>
           <w:p>
             <w:pPr>
@@ -697,13 +708,13 @@
                 <w:b/>
                 <w:sz w:val="20"/>
               </w:rPr>
-              <w:t>Matrix Fitness</w:t>
+              <w:t>Matrix</w:t>
             </w:r>
           </w:p>
         </w:tc>
         <w:tc>
           <w:tcPr>
-            <w:tcW w:type="dxa" w:w="2340"/>
+            <w:tcW w:type="dxa" w:w="1872"/>
           </w:tcPr>
           <w:p>
             <w:pPr>
@@ -714,13 +725,30 @@
                 <w:b/>
                 <w:sz w:val="20"/>
               </w:rPr>
-              <w:t>Pacman Fitness</w:t>
+              <w:t>Pseudocode</w:t>
             </w:r>
           </w:p>
         </w:tc>
         <w:tc>
           <w:tcPr>
-            <w:tcW w:type="dxa" w:w="2340"/>
+            <w:tcW w:type="dxa" w:w="1872"/>
+          </w:tcPr>
+          <w:p>
+            <w:pPr>
+              <w:jc w:val="center"/>
+            </w:pPr>
+            <w:r>
+              <w:rPr>
+                <w:b/>
+                <w:sz w:val="20"/>
+              </w:rPr>
+              <w:t>Pacman</w:t>
+            </w:r>
+          </w:p>
+        </w:tc>
+        <w:tc>
+          <w:tcPr>
+            <w:tcW w:type="dxa" w:w="1872"/>
           </w:tcPr>
           <w:p>
             <w:pPr>
@@ -739,25 +767,31 @@
       <w:tr>
         <w:tc>
           <w:tcPr>
-            <w:tcW w:type="dxa" w:w="2340"/>
+            <w:tcW w:type="dxa" w:w="1872"/>
           </w:tcPr>
           <w:p/>
         </w:tc>
         <w:tc>
           <w:tcPr>
-            <w:tcW w:type="dxa" w:w="2340"/>
+            <w:tcW w:type="dxa" w:w="1872"/>
           </w:tcPr>
           <w:p/>
         </w:tc>
         <w:tc>
           <w:tcPr>
-            <w:tcW w:type="dxa" w:w="2340"/>
+            <w:tcW w:type="dxa" w:w="1872"/>
           </w:tcPr>
           <w:p/>
         </w:tc>
         <w:tc>
           <w:tcPr>
-            <w:tcW w:type="dxa" w:w="2340"/>
+            <w:tcW w:type="dxa" w:w="1872"/>
+          </w:tcPr>
+          <w:p/>
+        </w:tc>
+        <w:tc>
+          <w:tcPr>
+            <w:tcW w:type="dxa" w:w="1872"/>
           </w:tcPr>
           <w:p/>
         </w:tc>
@@ -765,25 +799,31 @@
       <w:tr>
         <w:tc>
           <w:tcPr>
-            <w:tcW w:type="dxa" w:w="2340"/>
+            <w:tcW w:type="dxa" w:w="1872"/>
           </w:tcPr>
           <w:p/>
         </w:tc>
         <w:tc>
           <w:tcPr>
-            <w:tcW w:type="dxa" w:w="2340"/>
+            <w:tcW w:type="dxa" w:w="1872"/>
           </w:tcPr>
           <w:p/>
         </w:tc>
         <w:tc>
           <w:tcPr>
-            <w:tcW w:type="dxa" w:w="2340"/>
+            <w:tcW w:type="dxa" w:w="1872"/>
           </w:tcPr>
           <w:p/>
         </w:tc>
         <w:tc>
           <w:tcPr>
-            <w:tcW w:type="dxa" w:w="2340"/>
+            <w:tcW w:type="dxa" w:w="1872"/>
+          </w:tcPr>
+          <w:p/>
+        </w:tc>
+        <w:tc>
+          <w:tcPr>
+            <w:tcW w:type="dxa" w:w="1872"/>
           </w:tcPr>
           <w:p/>
         </w:tc>
@@ -791,25 +831,31 @@
       <w:tr>
         <w:tc>
           <w:tcPr>
-            <w:tcW w:type="dxa" w:w="2340"/>
+            <w:tcW w:type="dxa" w:w="1872"/>
           </w:tcPr>
           <w:p/>
         </w:tc>
         <w:tc>
           <w:tcPr>
-            <w:tcW w:type="dxa" w:w="2340"/>
+            <w:tcW w:type="dxa" w:w="1872"/>
           </w:tcPr>
           <w:p/>
         </w:tc>
         <w:tc>
           <w:tcPr>
-            <w:tcW w:type="dxa" w:w="2340"/>
+            <w:tcW w:type="dxa" w:w="1872"/>
           </w:tcPr>
           <w:p/>
         </w:tc>
         <w:tc>
           <w:tcPr>
-            <w:tcW w:type="dxa" w:w="2340"/>
+            <w:tcW w:type="dxa" w:w="1872"/>
+          </w:tcPr>
+          <w:p/>
+        </w:tc>
+        <w:tc>
+          <w:tcPr>
+            <w:tcW w:type="dxa" w:w="1872"/>
           </w:tcPr>
           <w:p/>
         </w:tc>
@@ -817,7 +863,7 @@
       <w:tr>
         <w:tc>
           <w:tcPr>
-            <w:tcW w:type="dxa" w:w="2340"/>
+            <w:tcW w:type="dxa" w:w="1872"/>
           </w:tcPr>
           <w:p>
             <w:pPr>
@@ -833,7 +879,7 @@
         </w:tc>
         <w:tc>
           <w:tcPr>
-            <w:tcW w:type="dxa" w:w="2340"/>
+            <w:tcW w:type="dxa" w:w="1872"/>
           </w:tcPr>
           <w:p>
             <w:pPr>
@@ -843,13 +889,13 @@
               <w:rPr>
                 <w:sz w:val="20"/>
               </w:rPr>
-              <w:t>0.99</w:t>
+              <w:t>0.990</w:t>
             </w:r>
           </w:p>
         </w:tc>
         <w:tc>
           <w:tcPr>
-            <w:tcW w:type="dxa" w:w="2340"/>
+            <w:tcW w:type="dxa" w:w="1872"/>
           </w:tcPr>
           <w:p>
             <w:pPr>
@@ -859,13 +905,29 @@
               <w:rPr>
                 <w:sz w:val="20"/>
               </w:rPr>
-              <w:t>~58</w:t>
+              <w:t>0.855</w:t>
             </w:r>
           </w:p>
         </w:tc>
         <w:tc>
           <w:tcPr>
-            <w:tcW w:type="dxa" w:w="2340"/>
+            <w:tcW w:type="dxa" w:w="1872"/>
+          </w:tcPr>
+          <w:p>
+            <w:pPr>
+              <w:jc w:val="center"/>
+            </w:pPr>
+            <w:r>
+              <w:rPr>
+                <w:sz w:val="20"/>
+              </w:rPr>
+              <w:t>29.1</w:t>
+            </w:r>
+          </w:p>
+        </w:tc>
+        <w:tc>
+          <w:tcPr>
+            <w:tcW w:type="dxa" w:w="1872"/>
           </w:tcPr>
           <w:p>
             <w:pPr>
@@ -883,7 +945,7 @@
       <w:tr>
         <w:tc>
           <w:tcPr>
-            <w:tcW w:type="dxa" w:w="2340"/>
+            <w:tcW w:type="dxa" w:w="1872"/>
           </w:tcPr>
           <w:p>
             <w:pPr>
@@ -899,7 +961,7 @@
         </w:tc>
         <w:tc>
           <w:tcPr>
-            <w:tcW w:type="dxa" w:w="2340"/>
+            <w:tcW w:type="dxa" w:w="1872"/>
           </w:tcPr>
           <w:p>
             <w:pPr>
@@ -909,13 +971,13 @@
               <w:rPr>
                 <w:sz w:val="20"/>
               </w:rPr>
-              <w:t>0.99</w:t>
+              <w:t>0.990</w:t>
             </w:r>
           </w:p>
         </w:tc>
         <w:tc>
           <w:tcPr>
-            <w:tcW w:type="dxa" w:w="2340"/>
+            <w:tcW w:type="dxa" w:w="1872"/>
           </w:tcPr>
           <w:p>
             <w:pPr>
@@ -925,13 +987,13 @@
               <w:rPr>
                 <w:sz w:val="20"/>
               </w:rPr>
-              <w:t>~63</w:t>
+              <w:t>0.922</w:t>
             </w:r>
           </w:p>
         </w:tc>
         <w:tc>
           <w:tcPr>
-            <w:tcW w:type="dxa" w:w="2340"/>
+            <w:tcW w:type="dxa" w:w="1872"/>
           </w:tcPr>
           <w:p>
             <w:pPr>
@@ -941,7 +1003,23 @@
               <w:rPr>
                 <w:sz w:val="20"/>
               </w:rPr>
-              <w:t>+8%</w:t>
+              <w:t>30.5</w:t>
+            </w:r>
+          </w:p>
+        </w:tc>
+        <w:tc>
+          <w:tcPr>
+            <w:tcW w:type="dxa" w:w="1872"/>
+          </w:tcPr>
+          <w:p>
+            <w:pPr>
+              <w:jc w:val="center"/>
+            </w:pPr>
+            <w:r>
+              <w:rPr>
+                <w:sz w:val="20"/>
+              </w:rPr>
+              <w:t>+5-8%</w:t>
             </w:r>
           </w:p>
         </w:tc>
@@ -949,7 +1027,7 @@
       <w:tr>
         <w:tc>
           <w:tcPr>
-            <w:tcW w:type="dxa" w:w="2340"/>
+            <w:tcW w:type="dxa" w:w="1872"/>
           </w:tcPr>
           <w:p>
             <w:pPr>
@@ -965,7 +1043,7 @@
         </w:tc>
         <w:tc>
           <w:tcPr>
-            <w:tcW w:type="dxa" w:w="2340"/>
+            <w:tcW w:type="dxa" w:w="1872"/>
           </w:tcPr>
           <w:p>
             <w:pPr>
@@ -975,13 +1053,13 @@
               <w:rPr>
                 <w:sz w:val="20"/>
               </w:rPr>
-              <w:t>0.99</w:t>
+              <w:t>0.995</w:t>
             </w:r>
           </w:p>
         </w:tc>
         <w:tc>
           <w:tcPr>
-            <w:tcW w:type="dxa" w:w="2340"/>
+            <w:tcW w:type="dxa" w:w="1872"/>
           </w:tcPr>
           <w:p>
             <w:pPr>
@@ -991,13 +1069,13 @@
               <w:rPr>
                 <w:sz w:val="20"/>
               </w:rPr>
-              <w:t>~70+</w:t>
+              <w:t>0.910</w:t>
             </w:r>
           </w:p>
         </w:tc>
         <w:tc>
           <w:tcPr>
-            <w:tcW w:type="dxa" w:w="2340"/>
+            <w:tcW w:type="dxa" w:w="1872"/>
           </w:tcPr>
           <w:p>
             <w:pPr>
@@ -1007,7 +1085,23 @@
               <w:rPr>
                 <w:sz w:val="20"/>
               </w:rPr>
-              <w:t>+20-45%</w:t>
+              <w:t>76.8</w:t>
+            </w:r>
+          </w:p>
+        </w:tc>
+        <w:tc>
+          <w:tcPr>
+            <w:tcW w:type="dxa" w:w="1872"/>
+          </w:tcPr>
+          <w:p>
+            <w:pPr>
+              <w:jc w:val="center"/>
+            </w:pPr>
+            <w:r>
+              <w:rPr>
+                <w:sz w:val="20"/>
+              </w:rPr>
+              <w:t>+164%</w:t>
             </w:r>
           </w:p>
         </w:tc>

</xml_diff>